<commit_message>
Trim manuscript bibliography to 40 cited references
AMA style requires references to be cited in order of appearance in the
text. The previous version listed 45 refs but only 40 were cited; the
five uncited entries are removed. All 40 numbered citations in the text
now match the bibliography.

Co-Authored-By: Claude Opus 4.7 (1M context) <noreply@anthropic.com>
</commit_message>
<xml_diff>
--- a/submission_phm_revision/manuscript.docx
+++ b/submission_phm_revision/manuscript.docx
@@ -318,7 +318,7 @@
         <w:t xml:space="preserve"> </w:t>
       </w:r>
       <w:r>
-        <w:t xml:space="preserve">45</w:t>
+        <w:t xml:space="preserve">40</w:t>
       </w:r>
     </w:p>
     <w:p>
@@ -9510,126 +9510,6 @@
       </w:r>
       <w:r>
         <w:t xml:space="preserve">. 2005;61(4):962-973.</w:t>
-      </w:r>
-    </w:p>
-    <w:p>
-      <w:pPr>
-        <w:numPr>
-          <w:ilvl w:val="0"/>
-          <w:numId w:val="1002"/>
-        </w:numPr>
-      </w:pPr>
-      <w:r>
-        <w:t xml:space="preserve">Hahn PR, Murray JS, Carvalho CM. Bayesian regression tree models for causal inference: regularization, confounding, and heterogeneous effects.</w:t>
-      </w:r>
-      <w:r>
-        <w:t xml:space="preserve"> </w:t>
-      </w:r>
-      <w:r>
-        <w:rPr>
-          <w:i/>
-          <w:iCs/>
-        </w:rPr>
-        <w:t xml:space="preserve">Bayesian Anal</w:t>
-      </w:r>
-      <w:r>
-        <w:t xml:space="preserve">. 2020;15(3):965-1056.</w:t>
-      </w:r>
-    </w:p>
-    <w:p>
-      <w:pPr>
-        <w:numPr>
-          <w:ilvl w:val="0"/>
-          <w:numId w:val="1002"/>
-        </w:numPr>
-      </w:pPr>
-      <w:r>
-        <w:t xml:space="preserve">Chakraborty B, Murphy SA. Dynamic treatment regimes.</w:t>
-      </w:r>
-      <w:r>
-        <w:t xml:space="preserve"> </w:t>
-      </w:r>
-      <w:r>
-        <w:rPr>
-          <w:i/>
-          <w:iCs/>
-        </w:rPr>
-        <w:t xml:space="preserve">Annu Rev Stat Appl</w:t>
-      </w:r>
-      <w:r>
-        <w:t xml:space="preserve">. 2014;1:447-464.</w:t>
-      </w:r>
-    </w:p>
-    <w:p>
-      <w:pPr>
-        <w:numPr>
-          <w:ilvl w:val="0"/>
-          <w:numId w:val="1002"/>
-        </w:numPr>
-      </w:pPr>
-      <w:r>
-        <w:t xml:space="preserve">Murphy SA. Optimal dynamic treatment regimes.</w:t>
-      </w:r>
-      <w:r>
-        <w:t xml:space="preserve"> </w:t>
-      </w:r>
-      <w:r>
-        <w:rPr>
-          <w:i/>
-          <w:iCs/>
-        </w:rPr>
-        <w:t xml:space="preserve">J R Stat Soc Series B Stat Methodol</w:t>
-      </w:r>
-      <w:r>
-        <w:t xml:space="preserve">. 2003;65(2):331-355.</w:t>
-      </w:r>
-    </w:p>
-    <w:p>
-      <w:pPr>
-        <w:numPr>
-          <w:ilvl w:val="0"/>
-          <w:numId w:val="1002"/>
-        </w:numPr>
-      </w:pPr>
-      <w:r>
-        <w:t xml:space="preserve">Pourat N, Zhou W, Haley LA, et al. Health Resources and Services Administration-funded health centers reduce health care expenditures of California Medicaid managed care beneficiaries with complex needs.</w:t>
-      </w:r>
-      <w:r>
-        <w:t xml:space="preserve"> </w:t>
-      </w:r>
-      <w:r>
-        <w:rPr>
-          <w:i/>
-          <w:iCs/>
-        </w:rPr>
-        <w:t xml:space="preserve">Popul Health Manag</w:t>
-      </w:r>
-      <w:r>
-        <w:t xml:space="preserve">. 2025;28(3):117-124.</w:t>
-      </w:r>
-    </w:p>
-    <w:p>
-      <w:pPr>
-        <w:numPr>
-          <w:ilvl w:val="0"/>
-          <w:numId w:val="1002"/>
-        </w:numPr>
-      </w:pPr>
-      <w:r>
-        <w:t xml:space="preserve">Sakinah I, Bertozzi L, Patel S, et al. Additive impact of virtual urgent and emergency department at home care on value-based primary care for Medicaid and dual-eligible members.</w:t>
-      </w:r>
-      <w:r>
-        <w:t xml:space="preserve"> </w:t>
-      </w:r>
-      <w:r>
-        <w:rPr>
-          <w:i/>
-          <w:iCs/>
-        </w:rPr>
-        <w:t xml:space="preserve">Popul Health Manag</w:t>
-      </w:r>
-      <w:r>
-        <w:t xml:space="preserve">. 2025;28(3):173-178.</w:t>
       </w:r>
     </w:p>
     <w:bookmarkEnd w:id="53"/>

</xml_diff>